<commit_message>
Add README.md with project overview, specifications, design approach, and usage instructions
</commit_message>
<xml_diff>
--- a/Relazione reti logiche.docx
+++ b/Relazione reti logiche.docx
@@ -268,7 +268,7 @@
                     <pic:cNvPicPr/>
                   </pic:nvPicPr>
                   <pic:blipFill rotWithShape="1">
-                    <a:blip r:embed="rId5">
+                    <a:blip r:embed="rId7">
                       <a:extLst>
                         <a:ext uri="{28A0092B-C50C-407E-A947-70E740481C1C}">
                           <a14:useLocalDpi xmlns:a14="http://schemas.microsoft.com/office/drawing/2010/main" val="0"/>
@@ -589,19 +589,7 @@
         </w:numPr>
       </w:pPr>
       <w:r>
-        <w:t xml:space="preserve">Immettere in ingresso un angolo a piacere tra 0 e 359 gradi su </w:t>
-      </w:r>
-      <w:r>
-        <w:t>10</w:t>
-      </w:r>
-      <w:r>
-        <w:t xml:space="preserve"> bit </w:t>
-      </w:r>
-      <w:r>
-        <w:t xml:space="preserve">con l’ultimo bit a </w:t>
-      </w:r>
-      <w:r>
-        <w:t>zero</w:t>
+        <w:t>Immettere in ingresso un angolo a piacere tra 0 e 359 gradi</w:t>
       </w:r>
       <w:r>
         <w:t>.</w:t>
@@ -764,7 +752,7 @@
                     <pic:cNvPicPr/>
                   </pic:nvPicPr>
                   <pic:blipFill rotWithShape="1">
-                    <a:blip r:embed="rId6">
+                    <a:blip r:embed="rId8">
                       <a:extLst>
                         <a:ext uri="{28A0092B-C50C-407E-A947-70E740481C1C}">
                           <a14:useLocalDpi xmlns:a14="http://schemas.microsoft.com/office/drawing/2010/main" val="0"/>
@@ -825,13 +813,31 @@
         </w:numPr>
       </w:pPr>
       <w:r>
-        <w:t xml:space="preserve">FIRST_STAGE: prende l’angolo in ingresso e fa </w:t>
-      </w:r>
-      <w:r>
-        <w:t xml:space="preserve">le necessarie identità trigonometriche per trasformarlo tra 0° e 90°. Il modulo memorizza anche il segno </w:t>
-      </w:r>
-      <w:r>
-        <w:t>finale del seno, individuando il quadrante in cui è posto l’angolo.</w:t>
+        <w:t xml:space="preserve">FIRST_STAGE: prende l’angolo in ingresso e </w:t>
+      </w:r>
+      <w:r>
+        <w:t>lo trasforma, con</w:t>
+      </w:r>
+      <w:r>
+        <w:t xml:space="preserve"> </w:t>
+      </w:r>
+      <w:r>
+        <w:t xml:space="preserve">le identità trigonometriche </w:t>
+      </w:r>
+      <w:r>
+        <w:t xml:space="preserve">presentate, </w:t>
+      </w:r>
+      <w:r>
+        <w:t xml:space="preserve">tra 0° e 90°. Il modulo memorizza anche il segno </w:t>
+      </w:r>
+      <w:r>
+        <w:t>finale del seno</w:t>
+      </w:r>
+      <w:r>
+        <w:t xml:space="preserve"> in un registro</w:t>
+      </w:r>
+      <w:r>
+        <w:t>, individuando il quadrante in cui è posto l’angolo.</w:t>
       </w:r>
     </w:p>
     <w:p>
@@ -878,11 +884,7 @@
     </w:p>
     <w:p>
       <w:pPr>
-        <w:pStyle w:val="ListParagraph"/>
-        <w:numPr>
-          <w:ilvl w:val="0"/>
-          <w:numId w:val="14"/>
-        </w:numPr>
+        <w:ind w:left="360"/>
       </w:pPr>
       <w:r>
         <w:lastRenderedPageBreak/>
@@ -929,7 +931,7 @@
                     <pic:cNvPicPr/>
                   </pic:nvPicPr>
                   <pic:blipFill>
-                    <a:blip r:embed="rId7" cstate="print">
+                    <a:blip r:embed="rId9" cstate="print">
                       <a:extLst>
                         <a:ext uri="{28A0092B-C50C-407E-A947-70E740481C1C}">
                           <a14:useLocalDpi xmlns:a14="http://schemas.microsoft.com/office/drawing/2010/main" val="0"/>
@@ -1095,16 +1097,10 @@
         <w:t xml:space="preserve"> </w:t>
       </w:r>
       <w:r>
-        <w:t xml:space="preserve">in ingresso </w:t>
-      </w:r>
-      <w:r>
-        <w:t>con</w:t>
-      </w:r>
-      <w:r>
-        <w:t xml:space="preserve">, in uscita, </w:t>
-      </w:r>
-      <w:r>
-        <w:t>il riporto corrispondente;</w:t>
+        <w:t>in ingresso</w:t>
+      </w:r>
+      <w:r>
+        <w:t>. Previsto anche il riporto in uscita.</w:t>
       </w:r>
     </w:p>
     <w:p>
@@ -1551,6 +1547,79 @@
         <w:pStyle w:val="Heading2"/>
       </w:pPr>
       <w:r>
+        <w:t>REG_D</w:t>
+      </w:r>
+    </w:p>
+    <w:p>
+      <w:r>
+        <w:t>Ingressi:</w:t>
+      </w:r>
+    </w:p>
+    <w:p>
+      <w:pPr>
+        <w:pStyle w:val="ListParagraph"/>
+        <w:numPr>
+          <w:ilvl w:val="0"/>
+          <w:numId w:val="2"/>
+        </w:numPr>
+      </w:pPr>
+      <w:r>
+        <w:t>CLK: 1 bit; segnale di clock;</w:t>
+      </w:r>
+    </w:p>
+    <w:p>
+      <w:pPr>
+        <w:pStyle w:val="ListParagraph"/>
+        <w:numPr>
+          <w:ilvl w:val="0"/>
+          <w:numId w:val="2"/>
+        </w:numPr>
+      </w:pPr>
+      <w:r>
+        <w:t>RST: 1 bit; segnale di reset;</w:t>
+      </w:r>
+    </w:p>
+    <w:p>
+      <w:pPr>
+        <w:pStyle w:val="ListParagraph"/>
+        <w:numPr>
+          <w:ilvl w:val="0"/>
+          <w:numId w:val="2"/>
+        </w:numPr>
+      </w:pPr>
+      <w:r>
+        <w:t>D: 1 bit; ingresso bistabile;</w:t>
+      </w:r>
+    </w:p>
+    <w:p>
+      <w:r>
+        <w:t>Uscite:</w:t>
+      </w:r>
+    </w:p>
+    <w:p>
+      <w:pPr>
+        <w:pStyle w:val="ListParagraph"/>
+        <w:numPr>
+          <w:ilvl w:val="0"/>
+          <w:numId w:val="5"/>
+        </w:numPr>
+      </w:pPr>
+      <w:r>
+        <w:t>Q: 1 bit; uscita bistabile;</w:t>
+      </w:r>
+    </w:p>
+    <w:p>
+      <w:r>
+        <w:t>Descrizione: il modulo REG_D rappresenta un bistabile di tipo D.</w:t>
+      </w:r>
+    </w:p>
+    <w:p/>
+    <w:p>
+      <w:pPr>
+        <w:pStyle w:val="Heading2"/>
+      </w:pPr>
+      <w:r>
+        <w:lastRenderedPageBreak/>
         <w:t>ANGLE_COMPARATOR</w:t>
       </w:r>
     </w:p>
@@ -1693,263 +1762,264 @@
     </w:p>
     <w:p>
       <w:r>
+        <w:t>Vengono confrontati i Most Significant Bit di ogni operazione</w:t>
+      </w:r>
+      <w:r>
+        <w:t xml:space="preserve">. L’uscita </w:t>
+      </w:r>
+      <w:r>
+        <w:t>viene selezionata tra</w:t>
+      </w:r>
+      <w:r>
+        <w:t>:</w:t>
+      </w:r>
+    </w:p>
+    <w:p>
+      <w:pPr>
+        <w:pStyle w:val="ListParagraph"/>
+        <w:numPr>
+          <w:ilvl w:val="0"/>
+          <w:numId w:val="6"/>
+        </w:numPr>
+      </w:pPr>
+      <w:r>
+        <w:t>00 se la prima sottrazione ha Tmsb = 0;</w:t>
+      </w:r>
+    </w:p>
+    <w:p>
+      <w:pPr>
+        <w:pStyle w:val="ListParagraph"/>
+        <w:numPr>
+          <w:ilvl w:val="0"/>
+          <w:numId w:val="6"/>
+        </w:numPr>
+      </w:pPr>
+      <w:r>
+        <w:t xml:space="preserve">01 se la seconda sottrazione ha Tmsb = 0 e la prima </w:t>
+      </w:r>
+      <w:r>
+        <w:t>Tmsb = 1;</w:t>
+      </w:r>
+    </w:p>
+    <w:p>
+      <w:pPr>
+        <w:pStyle w:val="ListParagraph"/>
+        <w:numPr>
+          <w:ilvl w:val="0"/>
+          <w:numId w:val="6"/>
+        </w:numPr>
+      </w:pPr>
+      <w:r>
+        <w:t>10 se la terza sottrazione ha Tmsb = 0</w:t>
+      </w:r>
+      <w:r>
+        <w:t>,</w:t>
+      </w:r>
+      <w:r>
+        <w:t xml:space="preserve"> la seconda Tmsb = 1</w:t>
+      </w:r>
+      <w:r>
+        <w:t xml:space="preserve"> e la prima Tmsb = 1</w:t>
+      </w:r>
+      <w:r>
+        <w:t>;</w:t>
+      </w:r>
+    </w:p>
+    <w:p>
+      <w:pPr>
+        <w:pStyle w:val="ListParagraph"/>
+        <w:numPr>
+          <w:ilvl w:val="0"/>
+          <w:numId w:val="6"/>
+        </w:numPr>
+      </w:pPr>
+      <w:r>
+        <w:t>11 in tutti gli altri casi</w:t>
+      </w:r>
+    </w:p>
+    <w:p>
+      <w:pPr>
+        <w:pStyle w:val="Heading2"/>
+      </w:pPr>
+      <w:r>
+        <w:t>ANGLE_ADAPTER</w:t>
+      </w:r>
+    </w:p>
+    <w:p>
+      <w:r>
+        <w:t>Ingressi:</w:t>
+      </w:r>
+    </w:p>
+    <w:p>
+      <w:pPr>
+        <w:pStyle w:val="ListParagraph"/>
+        <w:numPr>
+          <w:ilvl w:val="0"/>
+          <w:numId w:val="2"/>
+        </w:numPr>
+      </w:pPr>
+      <w:r>
+        <w:t xml:space="preserve">ANGLE: 10 bit; </w:t>
+      </w:r>
+      <w:r>
+        <w:t>valore in binario angolo</w:t>
+      </w:r>
+      <w:r>
+        <w:t>;</w:t>
+      </w:r>
+    </w:p>
+    <w:p>
+      <w:pPr>
+        <w:pStyle w:val="ListParagraph"/>
+        <w:numPr>
+          <w:ilvl w:val="0"/>
+          <w:numId w:val="2"/>
+        </w:numPr>
+      </w:pPr>
+      <w:r>
+        <w:t>QUADRANT: 2 bit; valore in uscita da ANGLE_COMPARATOR indicante il quadrante;</w:t>
+      </w:r>
+    </w:p>
+    <w:p>
+      <w:r>
+        <w:t>Uscite:</w:t>
+      </w:r>
+    </w:p>
+    <w:p>
+      <w:pPr>
+        <w:pStyle w:val="ListParagraph"/>
+        <w:numPr>
+          <w:ilvl w:val="0"/>
+          <w:numId w:val="5"/>
+        </w:numPr>
+      </w:pPr>
+      <w:r>
+        <w:t xml:space="preserve">RESULT: </w:t>
+      </w:r>
+      <w:r>
+        <w:t>7 bit</w:t>
+      </w:r>
+      <w:r>
+        <w:t>;</w:t>
+      </w:r>
+      <w:r>
+        <w:t xml:space="preserve"> angolo trasformato tra 0 e 90 gradi;</w:t>
+      </w:r>
+    </w:p>
+    <w:p>
+      <w:pPr>
+        <w:pStyle w:val="ListParagraph"/>
+        <w:numPr>
+          <w:ilvl w:val="0"/>
+          <w:numId w:val="5"/>
+        </w:numPr>
+      </w:pPr>
+      <w:r>
+        <w:t>SIGN: 1 bit; bit di segno per la successiva trasformazione del seno in uscita;</w:t>
+      </w:r>
+    </w:p>
+    <w:p>
+      <w:r>
+        <w:t xml:space="preserve">Componenti: </w:t>
+      </w:r>
+      <w:r>
+        <w:t xml:space="preserve">3 x </w:t>
+      </w:r>
+      <w:r>
+        <w:t>ADDER_SUBTRACTOR_N</w:t>
+      </w:r>
+    </w:p>
+    <w:p>
+      <w:r>
+        <w:t xml:space="preserve">Descrizione: </w:t>
+      </w:r>
+      <w:r>
+        <w:t xml:space="preserve">il modulo ANGLE_ADAPTER </w:t>
+      </w:r>
+      <w:r>
+        <w:t xml:space="preserve">ha l’obiettivo di </w:t>
+      </w:r>
+      <w:r>
+        <w:t xml:space="preserve">trasformare l’angolo in ingresso tra 0 e 90 gradi, se necessario. </w:t>
+      </w:r>
+      <w:r>
+        <w:t>Calcola 3 differenti operazioni:</w:t>
+      </w:r>
+    </w:p>
+    <w:p>
+      <w:pPr>
+        <w:pStyle w:val="ListParagraph"/>
+        <w:numPr>
+          <w:ilvl w:val="0"/>
+          <w:numId w:val="7"/>
+        </w:numPr>
+      </w:pPr>
+      <w:r>
+        <w:t xml:space="preserve">180 – </w:t>
+      </w:r>
+      <w:r>
+        <w:t>ANGLE</w:t>
+      </w:r>
+      <w:r>
+        <w:t>, in caso l’angolo sia nel secondo quadrante;</w:t>
+      </w:r>
+    </w:p>
+    <w:p>
+      <w:pPr>
+        <w:pStyle w:val="ListParagraph"/>
+        <w:numPr>
+          <w:ilvl w:val="0"/>
+          <w:numId w:val="7"/>
+        </w:numPr>
+      </w:pPr>
+      <w:r>
+        <w:t>ANGLE – 180, in caso l’angolo sia nel terzo quadrante;</w:t>
+      </w:r>
+    </w:p>
+    <w:p>
+      <w:pPr>
+        <w:pStyle w:val="ListParagraph"/>
+        <w:numPr>
+          <w:ilvl w:val="0"/>
+          <w:numId w:val="7"/>
+        </w:numPr>
+      </w:pPr>
+      <w:r>
+        <w:t>360 – ANGLE, in caso l’angolo sia nel quarto quadrante</w:t>
+      </w:r>
+      <w:r>
+        <w:t>;</w:t>
+      </w:r>
+    </w:p>
+    <w:p>
+      <w:r>
+        <w:t xml:space="preserve">Il risultato corretto </w:t>
+      </w:r>
+      <w:r>
+        <w:t xml:space="preserve">(RESULT) </w:t>
+      </w:r>
+      <w:r>
+        <w:t xml:space="preserve">viene selezionato </w:t>
+      </w:r>
+      <w:r>
+        <w:t>controllando il valore di QUADRANT, uscita del modulo ANGLE_COMPARATOR.</w:t>
+      </w:r>
+    </w:p>
+    <w:p>
+      <w:r>
+        <w:t>Il bit SIGN viene scelto allo stesso modo</w:t>
+      </w:r>
+      <w:r>
+        <w:t xml:space="preserve"> ed è 0 per il primo e il secondo quadrante, 1 per gli altri casi.</w:t>
+      </w:r>
+    </w:p>
+    <w:p/>
+    <w:p>
+      <w:pPr>
+        <w:pStyle w:val="Heading2"/>
+      </w:pPr>
+      <w:r>
         <w:lastRenderedPageBreak/>
-        <w:t>Vengono confrontati i Most Significant Bit di ogni operazione</w:t>
-      </w:r>
-      <w:r>
-        <w:t xml:space="preserve">. L’uscita </w:t>
-      </w:r>
-      <w:r>
-        <w:t>viene selezionata tra</w:t>
-      </w:r>
-      <w:r>
-        <w:t>:</w:t>
-      </w:r>
-    </w:p>
-    <w:p>
-      <w:pPr>
-        <w:pStyle w:val="ListParagraph"/>
-        <w:numPr>
-          <w:ilvl w:val="0"/>
-          <w:numId w:val="6"/>
-        </w:numPr>
-      </w:pPr>
-      <w:r>
-        <w:t>00 se la prima sottrazione ha Tmsb = 0;</w:t>
-      </w:r>
-    </w:p>
-    <w:p>
-      <w:pPr>
-        <w:pStyle w:val="ListParagraph"/>
-        <w:numPr>
-          <w:ilvl w:val="0"/>
-          <w:numId w:val="6"/>
-        </w:numPr>
-      </w:pPr>
-      <w:r>
-        <w:t xml:space="preserve">01 se la seconda sottrazione ha Tmsb = 0 e la prima </w:t>
-      </w:r>
-      <w:r>
-        <w:t>Tmsb = 1;</w:t>
-      </w:r>
-    </w:p>
-    <w:p>
-      <w:pPr>
-        <w:pStyle w:val="ListParagraph"/>
-        <w:numPr>
-          <w:ilvl w:val="0"/>
-          <w:numId w:val="6"/>
-        </w:numPr>
-      </w:pPr>
-      <w:r>
-        <w:t>10 se la terza sottrazione ha Tmsb = 0</w:t>
-      </w:r>
-      <w:r>
-        <w:t>,</w:t>
-      </w:r>
-      <w:r>
-        <w:t xml:space="preserve"> la seconda Tmsb = 1</w:t>
-      </w:r>
-      <w:r>
-        <w:t xml:space="preserve"> e la prima Tmsb = 1</w:t>
-      </w:r>
-      <w:r>
-        <w:t>;</w:t>
-      </w:r>
-    </w:p>
-    <w:p>
-      <w:pPr>
-        <w:pStyle w:val="ListParagraph"/>
-        <w:numPr>
-          <w:ilvl w:val="0"/>
-          <w:numId w:val="6"/>
-        </w:numPr>
-      </w:pPr>
-      <w:r>
-        <w:t>11 in tutti gli altri casi</w:t>
-      </w:r>
-    </w:p>
-    <w:p>
-      <w:pPr>
-        <w:pStyle w:val="Heading2"/>
-      </w:pPr>
-      <w:r>
-        <w:t>ANGLE_ADAPTER</w:t>
-      </w:r>
-    </w:p>
-    <w:p>
-      <w:r>
-        <w:t>Ingressi:</w:t>
-      </w:r>
-    </w:p>
-    <w:p>
-      <w:pPr>
-        <w:pStyle w:val="ListParagraph"/>
-        <w:numPr>
-          <w:ilvl w:val="0"/>
-          <w:numId w:val="2"/>
-        </w:numPr>
-      </w:pPr>
-      <w:r>
-        <w:t xml:space="preserve">ANGLE: 10 bit; </w:t>
-      </w:r>
-      <w:r>
-        <w:t>valore in binario angolo</w:t>
-      </w:r>
-      <w:r>
-        <w:t>;</w:t>
-      </w:r>
-    </w:p>
-    <w:p>
-      <w:pPr>
-        <w:pStyle w:val="ListParagraph"/>
-        <w:numPr>
-          <w:ilvl w:val="0"/>
-          <w:numId w:val="2"/>
-        </w:numPr>
-      </w:pPr>
-      <w:r>
-        <w:t>QUADRANT: 2 bit; valore in uscita da ANGLE_COMPARATOR indicante il quadrante;</w:t>
-      </w:r>
-    </w:p>
-    <w:p>
-      <w:r>
-        <w:t>Uscite:</w:t>
-      </w:r>
-    </w:p>
-    <w:p>
-      <w:pPr>
-        <w:pStyle w:val="ListParagraph"/>
-        <w:numPr>
-          <w:ilvl w:val="0"/>
-          <w:numId w:val="5"/>
-        </w:numPr>
-      </w:pPr>
-      <w:r>
-        <w:t xml:space="preserve">RESULT: </w:t>
-      </w:r>
-      <w:r>
-        <w:t>7 bit</w:t>
-      </w:r>
-      <w:r>
-        <w:t>;</w:t>
-      </w:r>
-      <w:r>
-        <w:t xml:space="preserve"> angolo trasformato tra 0 e 90 gradi;</w:t>
-      </w:r>
-    </w:p>
-    <w:p>
-      <w:pPr>
-        <w:pStyle w:val="ListParagraph"/>
-        <w:numPr>
-          <w:ilvl w:val="0"/>
-          <w:numId w:val="5"/>
-        </w:numPr>
-      </w:pPr>
-      <w:r>
-        <w:t>SIGN: 1 bit; bit di segno per la successiva trasformazione del seno in uscita;</w:t>
-      </w:r>
-    </w:p>
-    <w:p>
-      <w:r>
-        <w:t xml:space="preserve">Componenti: </w:t>
-      </w:r>
-      <w:r>
-        <w:t xml:space="preserve">3 x </w:t>
-      </w:r>
-      <w:r>
-        <w:t>ADDER_SUBTRACTOR_N</w:t>
-      </w:r>
-    </w:p>
-    <w:p>
-      <w:r>
-        <w:t xml:space="preserve">Descrizione: </w:t>
-      </w:r>
-      <w:r>
-        <w:t xml:space="preserve">il modulo ANGLE_ADAPTER </w:t>
-      </w:r>
-      <w:r>
-        <w:t xml:space="preserve">ha l’obiettivo di </w:t>
-      </w:r>
-      <w:r>
-        <w:t xml:space="preserve">trasformare l’angolo in ingresso tra 0 e 90 gradi, se necessario. </w:t>
-      </w:r>
-      <w:r>
-        <w:t>Calcola 3 differenti operazioni:</w:t>
-      </w:r>
-    </w:p>
-    <w:p>
-      <w:pPr>
-        <w:pStyle w:val="ListParagraph"/>
-        <w:numPr>
-          <w:ilvl w:val="0"/>
-          <w:numId w:val="7"/>
-        </w:numPr>
-      </w:pPr>
-      <w:r>
-        <w:t xml:space="preserve">180 – </w:t>
-      </w:r>
-      <w:r>
-        <w:t>ANGLE</w:t>
-      </w:r>
-      <w:r>
-        <w:t>, in caso l’angolo sia nel secondo quadrante;</w:t>
-      </w:r>
-    </w:p>
-    <w:p>
-      <w:pPr>
-        <w:pStyle w:val="ListParagraph"/>
-        <w:numPr>
-          <w:ilvl w:val="0"/>
-          <w:numId w:val="7"/>
-        </w:numPr>
-      </w:pPr>
-      <w:r>
-        <w:t>ANGLE – 180, in caso l’angolo sia nel terzo quadrante;</w:t>
-      </w:r>
-    </w:p>
-    <w:p>
-      <w:pPr>
-        <w:pStyle w:val="ListParagraph"/>
-        <w:numPr>
-          <w:ilvl w:val="0"/>
-          <w:numId w:val="7"/>
-        </w:numPr>
-      </w:pPr>
-      <w:r>
-        <w:t>360 – ANGLE, in caso l’angolo sia nel quarto quadrante</w:t>
-      </w:r>
-      <w:r>
-        <w:t>;</w:t>
-      </w:r>
-    </w:p>
-    <w:p>
-      <w:r>
-        <w:t xml:space="preserve">Il risultato corretto </w:t>
-      </w:r>
-      <w:r>
-        <w:t xml:space="preserve">(RESULT) </w:t>
-      </w:r>
-      <w:r>
-        <w:t xml:space="preserve">viene selezionato </w:t>
-      </w:r>
-      <w:r>
-        <w:t>controllando il valore di QUADRANT, uscita del modulo ANGLE_COMPARATOR.</w:t>
-      </w:r>
-    </w:p>
-    <w:p>
-      <w:r>
-        <w:t>Il bit SIGN viene scelto allo stesso modo</w:t>
-      </w:r>
-      <w:r>
-        <w:t xml:space="preserve"> ed è 0 per il primo e il secondo quadrante, 1 per gli altri casi.</w:t>
-      </w:r>
-    </w:p>
-    <w:p>
-      <w:pPr>
-        <w:pStyle w:val="Heading2"/>
-      </w:pPr>
-      <w:r>
         <w:t>FIRST_STAGE</w:t>
       </w:r>
     </w:p>
@@ -2065,7 +2135,6 @@
           <w:noProof/>
           <w14:ligatures w14:val="standardContextual"/>
         </w:rPr>
-        <w:lastRenderedPageBreak/>
         <w:drawing>
           <wp:inline distT="0" distB="0" distL="0" distR="0" wp14:anchorId="191087F7" wp14:editId="69BA583E">
             <wp:extent cx="4345065" cy="1054735"/>
@@ -2082,7 +2151,7 @@
                     <pic:cNvPicPr/>
                   </pic:nvPicPr>
                   <pic:blipFill>
-                    <a:blip r:embed="rId8" cstate="print">
+                    <a:blip r:embed="rId10" cstate="print">
                       <a:extLst>
                         <a:ext uri="{28A0092B-C50C-407E-A947-70E740481C1C}">
                           <a14:useLocalDpi xmlns:a14="http://schemas.microsoft.com/office/drawing/2010/main" val="0"/>
@@ -2294,7 +2363,13 @@
         <w:t xml:space="preserve">. </w:t>
       </w:r>
       <w:r>
-        <w:t>L’indice della LUT è calcolat</w:t>
+        <w:t xml:space="preserve">L’indice della </w:t>
+      </w:r>
+      <w:r>
+        <w:t>lookup-table</w:t>
+      </w:r>
+      <w:r>
+        <w:t xml:space="preserve"> è calcolat</w:t>
       </w:r>
       <w:r>
         <w:t>o</w:t>
@@ -2386,6 +2461,7 @@
     </w:p>
     <w:p>
       <w:r>
+        <w:lastRenderedPageBreak/>
         <w:t>Componenti: ADDER_SUBTRACTOR_N</w:t>
       </w:r>
     </w:p>
@@ -2504,7 +2580,6 @@
     </w:p>
     <w:p>
       <w:r>
-        <w:lastRenderedPageBreak/>
         <w:t xml:space="preserve">Descrizione: il modulo </w:t>
       </w:r>
       <w:r>
@@ -2568,28 +2643,13 @@
         <w:t>Allo stesso modo, per</w:t>
       </w:r>
       <w:r>
-        <w:t xml:space="preserve"> PP_1 viene fatto l’AND per i bit </w:t>
-      </w:r>
-      <w:r>
-        <w:t>tra i</w:t>
-      </w:r>
-      <w:r>
-        <w:t xml:space="preserve">l secondo </w:t>
-      </w:r>
-      <w:r>
-        <w:t xml:space="preserve">e </w:t>
-      </w:r>
-      <w:r>
-        <w:t>l’undicesimo</w:t>
-      </w:r>
-      <w:r>
-        <w:t xml:space="preserve"> </w:t>
-      </w:r>
-      <w:r>
-        <w:t xml:space="preserve">bit </w:t>
-      </w:r>
-      <w:r>
-        <w:t>di DELTA_Y</w:t>
+        <w:t xml:space="preserve"> PP_1 viene fatto l’AND </w:t>
+      </w:r>
+      <w:r>
+        <w:t>tra i bit di</w:t>
+      </w:r>
+      <w:r>
+        <w:t xml:space="preserve"> DELTA_Y</w:t>
       </w:r>
       <w:r>
         <w:t xml:space="preserve"> e il secondo bit di DELTA_X</w:t>
@@ -2604,16 +2664,28 @@
         <w:t xml:space="preserve"> due zeri di padding, uno al primo bit, l’altro all’ultimo. </w:t>
       </w:r>
       <w:r>
-        <w:t xml:space="preserve">In ultima analisi, anche PP_2 è stato generato sulla falsa riga degli altri prodotti parziali: due zeri di padding per primo e secondo bit e AND </w:t>
+        <w:t xml:space="preserve">In ultima analisi, anche PP_2 è generato sulla falsa riga degli altri prodotti parziali: due zeri di padding per primo e secondo bit e AND </w:t>
       </w:r>
       <w:r>
         <w:t xml:space="preserve">bit a bit </w:t>
       </w:r>
       <w:r>
-        <w:t>tra il terzo e il dodicesimo bit</w:t>
-      </w:r>
-      <w:r>
-        <w:t xml:space="preserve"> di DELTA_Y e terzo bit di DELTA_X.</w:t>
+        <w:t xml:space="preserve">tra </w:t>
+      </w:r>
+      <w:r>
+        <w:t>i</w:t>
+      </w:r>
+      <w:r>
+        <w:t xml:space="preserve"> bit</w:t>
+      </w:r>
+      <w:r>
+        <w:t xml:space="preserve"> di DELTA_Y e </w:t>
+      </w:r>
+      <w:r>
+        <w:t xml:space="preserve">il </w:t>
+      </w:r>
+      <w:r>
+        <w:t>terzo bit di DELTA_X.</w:t>
       </w:r>
     </w:p>
     <w:p>
@@ -2968,11 +3040,13 @@
         <w:t>calcolo del risultato finale.</w:t>
       </w:r>
     </w:p>
+    <w:p/>
     <w:p>
       <w:pPr>
         <w:pStyle w:val="Heading2"/>
       </w:pPr>
       <w:r>
+        <w:lastRenderedPageBreak/>
         <w:t>SECOND_STAGE</w:t>
       </w:r>
     </w:p>
@@ -3058,9 +3132,8 @@
           <w:noProof/>
           <w14:ligatures w14:val="standardContextual"/>
         </w:rPr>
-        <w:lastRenderedPageBreak/>
         <w:drawing>
-          <wp:inline distT="0" distB="0" distL="0" distR="0" wp14:anchorId="7B8BEAF2" wp14:editId="7E9F4828">
+          <wp:inline distT="0" distB="0" distL="0" distR="0" wp14:anchorId="7B8BEAF2" wp14:editId="1BE9B9E3">
             <wp:extent cx="5731510" cy="1031875"/>
             <wp:effectExtent l="0" t="0" r="0" b="0"/>
             <wp:docPr id="944548463" name="Picture 4"/>
@@ -3075,7 +3148,7 @@
                     <pic:cNvPicPr/>
                   </pic:nvPicPr>
                   <pic:blipFill>
-                    <a:blip r:embed="rId9" cstate="print">
+                    <a:blip r:embed="rId11" cstate="print">
                       <a:extLst>
                         <a:ext uri="{28A0092B-C50C-407E-A947-70E740481C1C}">
                           <a14:useLocalDpi xmlns:a14="http://schemas.microsoft.com/office/drawing/2010/main" val="0"/>
@@ -3107,86 +3180,6 @@
         <w:pStyle w:val="Heading2"/>
       </w:pPr>
       <w:r>
-        <w:t>REG_D</w:t>
-      </w:r>
-    </w:p>
-    <w:p>
-      <w:r>
-        <w:t>Ingressi:</w:t>
-      </w:r>
-    </w:p>
-    <w:p>
-      <w:pPr>
-        <w:pStyle w:val="ListParagraph"/>
-        <w:numPr>
-          <w:ilvl w:val="0"/>
-          <w:numId w:val="2"/>
-        </w:numPr>
-      </w:pPr>
-      <w:r>
-        <w:t>CLK: 1 bit; segnale di clock;</w:t>
-      </w:r>
-    </w:p>
-    <w:p>
-      <w:pPr>
-        <w:pStyle w:val="ListParagraph"/>
-        <w:numPr>
-          <w:ilvl w:val="0"/>
-          <w:numId w:val="2"/>
-        </w:numPr>
-      </w:pPr>
-      <w:r>
-        <w:t>RST: 1 bit; segnale di reset;</w:t>
-      </w:r>
-    </w:p>
-    <w:p>
-      <w:pPr>
-        <w:pStyle w:val="ListParagraph"/>
-        <w:numPr>
-          <w:ilvl w:val="0"/>
-          <w:numId w:val="2"/>
-        </w:numPr>
-      </w:pPr>
-      <w:r>
-        <w:t>D: 1 bit; ingresso bistabile;</w:t>
-      </w:r>
-    </w:p>
-    <w:p>
-      <w:r>
-        <w:t>Uscite:</w:t>
-      </w:r>
-    </w:p>
-    <w:p>
-      <w:pPr>
-        <w:pStyle w:val="ListParagraph"/>
-        <w:numPr>
-          <w:ilvl w:val="0"/>
-          <w:numId w:val="5"/>
-        </w:numPr>
-      </w:pPr>
-      <w:r>
-        <w:t>Q: 1 bit; uscita bistabile;</w:t>
-      </w:r>
-    </w:p>
-    <w:p>
-      <w:r>
-        <w:t xml:space="preserve">Descrizione: il modulo REG_D rappresenta un </w:t>
-      </w:r>
-      <w:r>
-        <w:t xml:space="preserve">bistabile </w:t>
-      </w:r>
-      <w:r>
-        <w:t xml:space="preserve">di </w:t>
-      </w:r>
-      <w:r>
-        <w:t>tipo D.</w:t>
-      </w:r>
-    </w:p>
-    <w:p>
-      <w:pPr>
-        <w:pStyle w:val="Heading2"/>
-      </w:pPr>
-      <w:r>
         <w:t>THIRD_STAGE</w:t>
       </w:r>
     </w:p>
@@ -3318,7 +3311,7 @@
                     <pic:cNvPicPr/>
                   </pic:nvPicPr>
                   <pic:blipFill>
-                    <a:blip r:embed="rId10">
+                    <a:blip r:embed="rId12">
                       <a:extLst>
                         <a:ext uri="{28A0092B-C50C-407E-A947-70E740481C1C}">
                           <a14:useLocalDpi xmlns:a14="http://schemas.microsoft.com/office/drawing/2010/main" val="0"/>
@@ -3600,7 +3593,22 @@
     </w:p>
     <w:p>
       <w:r>
-        <w:t xml:space="preserve">Il controllo dei risultati è stato effettuato utilizzando l’istruzione “assert”, controllando che il valore in uscita </w:t>
+        <w:t>La verifica</w:t>
+      </w:r>
+      <w:r>
+        <w:t xml:space="preserve"> dei risultati è stat</w:t>
+      </w:r>
+      <w:r>
+        <w:t>a</w:t>
+      </w:r>
+      <w:r>
+        <w:t xml:space="preserve"> effettuat</w:t>
+      </w:r>
+      <w:r>
+        <w:t>a</w:t>
+      </w:r>
+      <w:r>
+        <w:t xml:space="preserve"> utilizzando l’istruzione “assert”, controllando che il valore in uscita </w:t>
       </w:r>
       <w:r>
         <w:t>fosse</w:t>
@@ -3816,13 +3824,199 @@
       </w:r>
     </w:p>
     <w:sectPr>
+      <w:footerReference w:type="even" r:id="rId13"/>
+      <w:footerReference w:type="default" r:id="rId14"/>
       <w:pgSz w:w="11906" w:h="16838"/>
       <w:pgMar w:top="1440" w:right="1440" w:bottom="1440" w:left="1440" w:header="709" w:footer="709" w:gutter="0"/>
       <w:cols w:space="708"/>
+      <w:titlePg/>
       <w:docGrid w:linePitch="360"/>
     </w:sectPr>
   </w:body>
 </w:document>
+</file>
+
+<file path=word/endnotes.xml><?xml version="1.0" encoding="utf-8"?>
+<w:endnotes xmlns:wpc="http://schemas.microsoft.com/office/word/2010/wordprocessingCanvas" xmlns:cx="http://schemas.microsoft.com/office/drawing/2014/chartex" xmlns:cx1="http://schemas.microsoft.com/office/drawing/2015/9/8/chartex" xmlns:cx2="http://schemas.microsoft.com/office/drawing/2015/10/21/chartex" xmlns:cx3="http://schemas.microsoft.com/office/drawing/2016/5/9/chartex" xmlns:cx4="http://schemas.microsoft.com/office/drawing/2016/5/10/chartex" xmlns:cx5="http://schemas.microsoft.com/office/drawing/2016/5/11/chartex" xmlns:cx6="http://schemas.microsoft.com/office/drawing/2016/5/12/chartex" xmlns:cx7="http://schemas.microsoft.com/office/drawing/2016/5/13/chartex" xmlns:cx8="http://schemas.microsoft.com/office/drawing/2016/5/14/chartex" xmlns:mc="http://schemas.openxmlformats.org/markup-compatibility/2006" xmlns:m="http://schemas.openxmlformats.org/officeDocument/2006/math" xmlns:aink="http://schemas.microsoft.com/office/drawing/2016/ink" xmlns:am3d="http://schemas.microsoft.com/office/drawing/2017/model3d" xmlns:oel="http://schemas.microsoft.com/office/2019/extlst" xmlns:r="http://schemas.openxmlformats.org/officeDocument/2006/relationships" xmlns:wp14="http://schemas.microsoft.com/office/word/2010/wordprocessingDrawing" xmlns:wp="http://schemas.openxmlformats.org/drawingml/2006/wordprocessingDrawing" xmlns:wpg="http://schemas.microsoft.com/office/word/2010/wordprocessingGroup" xmlns:wpi="http://schemas.microsoft.com/office/word/2010/wordprocessingInk" xmlns:wps="http://schemas.microsoft.com/office/word/2010/wordprocessingShape" xmlns:o="urn:schemas-microsoft-com:office:office" xmlns:v="urn:schemas-microsoft-com:vml" xmlns:w10="urn:schemas-microsoft-com:office:word" xmlns:w="http://schemas.openxmlformats.org/wordprocessingml/2006/main" xmlns:w14="http://schemas.microsoft.com/office/word/2010/wordml" xmlns:w15="http://schemas.microsoft.com/office/word/2012/wordml" xmlns:w16cex="http://schemas.microsoft.com/office/word/2018/wordml/cex" xmlns:w16cid="http://schemas.microsoft.com/office/word/2016/wordml/cid" xmlns:w16="http://schemas.microsoft.com/office/word/2018/wordml" xmlns:w16sdtdh="http://schemas.microsoft.com/office/word/2020/wordml/sdtdatahash" xmlns:w16sdtfl="http://schemas.microsoft.com/office/word/2024/wordml/sdtformatlock" xmlns:w16se="http://schemas.microsoft.com/office/word/2015/wordml/symex" xmlns:w16du="http://schemas.microsoft.com/office/word/2023/wordml/word16du" xmlns:wne="http://schemas.microsoft.com/office/word/2006/wordml" mc:Ignorable="w14 w15 w16se w16cid w16 w16cex w16sdtdh w16sdtfl w16du wp14">
+  <w:endnote w:type="separator" w:id="-1">
+    <w:p>
+      <w:pPr>
+        <w:spacing w:after="0" w:line="240" w:lineRule="auto"/>
+      </w:pPr>
+      <w:r>
+        <w:separator/>
+      </w:r>
+    </w:p>
+  </w:endnote>
+  <w:endnote w:type="continuationSeparator" w:id="0">
+    <w:p>
+      <w:pPr>
+        <w:spacing w:after="0" w:line="240" w:lineRule="auto"/>
+      </w:pPr>
+      <w:r>
+        <w:continuationSeparator/>
+      </w:r>
+    </w:p>
+  </w:endnote>
+</w:endnotes>
+</file>
+
+<file path=word/footer1.xml><?xml version="1.0" encoding="utf-8"?>
+<w:ftr xmlns:wpc="http://schemas.microsoft.com/office/word/2010/wordprocessingCanvas" xmlns:cx="http://schemas.microsoft.com/office/drawing/2014/chartex" xmlns:cx1="http://schemas.microsoft.com/office/drawing/2015/9/8/chartex" xmlns:cx2="http://schemas.microsoft.com/office/drawing/2015/10/21/chartex" xmlns:cx3="http://schemas.microsoft.com/office/drawing/2016/5/9/chartex" xmlns:cx4="http://schemas.microsoft.com/office/drawing/2016/5/10/chartex" xmlns:cx5="http://schemas.microsoft.com/office/drawing/2016/5/11/chartex" xmlns:cx6="http://schemas.microsoft.com/office/drawing/2016/5/12/chartex" xmlns:cx7="http://schemas.microsoft.com/office/drawing/2016/5/13/chartex" xmlns:cx8="http://schemas.microsoft.com/office/drawing/2016/5/14/chartex" xmlns:mc="http://schemas.openxmlformats.org/markup-compatibility/2006" xmlns:m="http://schemas.openxmlformats.org/officeDocument/2006/math" xmlns:aink="http://schemas.microsoft.com/office/drawing/2016/ink" xmlns:am3d="http://schemas.microsoft.com/office/drawing/2017/model3d" xmlns:oel="http://schemas.microsoft.com/office/2019/extlst" xmlns:r="http://schemas.openxmlformats.org/officeDocument/2006/relationships" xmlns:wp14="http://schemas.microsoft.com/office/word/2010/wordprocessingDrawing" xmlns:wp="http://schemas.openxmlformats.org/drawingml/2006/wordprocessingDrawing" xmlns:wpg="http://schemas.microsoft.com/office/word/2010/wordprocessingGroup" xmlns:wpi="http://schemas.microsoft.com/office/word/2010/wordprocessingInk" xmlns:wps="http://schemas.microsoft.com/office/word/2010/wordprocessingShape" xmlns:o="urn:schemas-microsoft-com:office:office" xmlns:v="urn:schemas-microsoft-com:vml" xmlns:w10="urn:schemas-microsoft-com:office:word" xmlns:w="http://schemas.openxmlformats.org/wordprocessingml/2006/main" xmlns:w14="http://schemas.microsoft.com/office/word/2010/wordml" xmlns:w15="http://schemas.microsoft.com/office/word/2012/wordml" xmlns:w16cex="http://schemas.microsoft.com/office/word/2018/wordml/cex" xmlns:w16cid="http://schemas.microsoft.com/office/word/2016/wordml/cid" xmlns:w16="http://schemas.microsoft.com/office/word/2018/wordml" xmlns:w16sdtdh="http://schemas.microsoft.com/office/word/2020/wordml/sdtdatahash" xmlns:w16sdtfl="http://schemas.microsoft.com/office/word/2024/wordml/sdtformatlock" xmlns:w16se="http://schemas.microsoft.com/office/word/2015/wordml/symex" xmlns:w16du="http://schemas.microsoft.com/office/word/2023/wordml/word16du" xmlns:wne="http://schemas.microsoft.com/office/word/2006/wordml" mc:Ignorable="w14 w15 w16se w16cid w16 w16cex w16sdtdh w16sdtfl w16du wp14">
+  <w:sdt>
+    <w:sdtPr>
+      <w:rPr>
+        <w:rStyle w:val="PageNumber"/>
+      </w:rPr>
+      <w:id w:val="-758135108"/>
+      <w:docPartObj>
+        <w:docPartGallery w:val="Page Numbers (Bottom of Page)"/>
+        <w:docPartUnique/>
+      </w:docPartObj>
+    </w:sdtPr>
+    <w:sdtEndPr>
+      <w:rPr>
+        <w:rStyle w:val="PageNumber"/>
+      </w:rPr>
+    </w:sdtEndPr>
+    <w:sdtContent>
+      <w:p>
+        <w:pPr>
+          <w:pStyle w:val="Footer"/>
+          <w:framePr w:wrap="none" w:vAnchor="text" w:hAnchor="margin" w:xAlign="right" w:y="1"/>
+          <w:rPr>
+            <w:rStyle w:val="PageNumber"/>
+          </w:rPr>
+        </w:pPr>
+        <w:r>
+          <w:rPr>
+            <w:rStyle w:val="PageNumber"/>
+          </w:rPr>
+          <w:fldChar w:fldCharType="begin"/>
+        </w:r>
+        <w:r>
+          <w:rPr>
+            <w:rStyle w:val="PageNumber"/>
+          </w:rPr>
+          <w:instrText xml:space="preserve"> PAGE </w:instrText>
+        </w:r>
+        <w:r>
+          <w:rPr>
+            <w:rStyle w:val="PageNumber"/>
+          </w:rPr>
+          <w:fldChar w:fldCharType="separate"/>
+        </w:r>
+        <w:r>
+          <w:rPr>
+            <w:rStyle w:val="PageNumber"/>
+          </w:rPr>
+          <w:fldChar w:fldCharType="end"/>
+        </w:r>
+      </w:p>
+    </w:sdtContent>
+  </w:sdt>
+  <w:p>
+    <w:pPr>
+      <w:pStyle w:val="Footer"/>
+      <w:ind w:right="360"/>
+    </w:pPr>
+  </w:p>
+</w:ftr>
+</file>
+
+<file path=word/footer2.xml><?xml version="1.0" encoding="utf-8"?>
+<w:ftr xmlns:wpc="http://schemas.microsoft.com/office/word/2010/wordprocessingCanvas" xmlns:cx="http://schemas.microsoft.com/office/drawing/2014/chartex" xmlns:cx1="http://schemas.microsoft.com/office/drawing/2015/9/8/chartex" xmlns:cx2="http://schemas.microsoft.com/office/drawing/2015/10/21/chartex" xmlns:cx3="http://schemas.microsoft.com/office/drawing/2016/5/9/chartex" xmlns:cx4="http://schemas.microsoft.com/office/drawing/2016/5/10/chartex" xmlns:cx5="http://schemas.microsoft.com/office/drawing/2016/5/11/chartex" xmlns:cx6="http://schemas.microsoft.com/office/drawing/2016/5/12/chartex" xmlns:cx7="http://schemas.microsoft.com/office/drawing/2016/5/13/chartex" xmlns:cx8="http://schemas.microsoft.com/office/drawing/2016/5/14/chartex" xmlns:mc="http://schemas.openxmlformats.org/markup-compatibility/2006" xmlns:m="http://schemas.openxmlformats.org/officeDocument/2006/math" xmlns:aink="http://schemas.microsoft.com/office/drawing/2016/ink" xmlns:am3d="http://schemas.microsoft.com/office/drawing/2017/model3d" xmlns:oel="http://schemas.microsoft.com/office/2019/extlst" xmlns:r="http://schemas.openxmlformats.org/officeDocument/2006/relationships" xmlns:wp14="http://schemas.microsoft.com/office/word/2010/wordprocessingDrawing" xmlns:wp="http://schemas.openxmlformats.org/drawingml/2006/wordprocessingDrawing" xmlns:wpg="http://schemas.microsoft.com/office/word/2010/wordprocessingGroup" xmlns:wpi="http://schemas.microsoft.com/office/word/2010/wordprocessingInk" xmlns:wps="http://schemas.microsoft.com/office/word/2010/wordprocessingShape" xmlns:o="urn:schemas-microsoft-com:office:office" xmlns:v="urn:schemas-microsoft-com:vml" xmlns:w10="urn:schemas-microsoft-com:office:word" xmlns:w="http://schemas.openxmlformats.org/wordprocessingml/2006/main" xmlns:w14="http://schemas.microsoft.com/office/word/2010/wordml" xmlns:w15="http://schemas.microsoft.com/office/word/2012/wordml" xmlns:w16cex="http://schemas.microsoft.com/office/word/2018/wordml/cex" xmlns:w16cid="http://schemas.microsoft.com/office/word/2016/wordml/cid" xmlns:w16="http://schemas.microsoft.com/office/word/2018/wordml" xmlns:w16sdtdh="http://schemas.microsoft.com/office/word/2020/wordml/sdtdatahash" xmlns:w16sdtfl="http://schemas.microsoft.com/office/word/2024/wordml/sdtformatlock" xmlns:w16se="http://schemas.microsoft.com/office/word/2015/wordml/symex" xmlns:w16du="http://schemas.microsoft.com/office/word/2023/wordml/word16du" xmlns:wne="http://schemas.microsoft.com/office/word/2006/wordml" mc:Ignorable="w14 w15 w16se w16cid w16 w16cex w16sdtdh w16sdtfl w16du wp14">
+  <w:sdt>
+    <w:sdtPr>
+      <w:rPr>
+        <w:rStyle w:val="PageNumber"/>
+      </w:rPr>
+      <w:id w:val="440040934"/>
+      <w:docPartObj>
+        <w:docPartGallery w:val="Page Numbers (Bottom of Page)"/>
+        <w:docPartUnique/>
+      </w:docPartObj>
+    </w:sdtPr>
+    <w:sdtEndPr>
+      <w:rPr>
+        <w:rStyle w:val="PageNumber"/>
+      </w:rPr>
+    </w:sdtEndPr>
+    <w:sdtContent>
+      <w:p>
+        <w:pPr>
+          <w:pStyle w:val="Footer"/>
+          <w:framePr w:wrap="none" w:vAnchor="text" w:hAnchor="margin" w:xAlign="right" w:y="1"/>
+          <w:rPr>
+            <w:rStyle w:val="PageNumber"/>
+          </w:rPr>
+        </w:pPr>
+        <w:r>
+          <w:rPr>
+            <w:rStyle w:val="PageNumber"/>
+          </w:rPr>
+          <w:fldChar w:fldCharType="begin"/>
+        </w:r>
+        <w:r>
+          <w:rPr>
+            <w:rStyle w:val="PageNumber"/>
+          </w:rPr>
+          <w:instrText xml:space="preserve"> PAGE </w:instrText>
+        </w:r>
+        <w:r>
+          <w:rPr>
+            <w:rStyle w:val="PageNumber"/>
+          </w:rPr>
+          <w:fldChar w:fldCharType="separate"/>
+        </w:r>
+        <w:r>
+          <w:rPr>
+            <w:rStyle w:val="PageNumber"/>
+            <w:noProof/>
+          </w:rPr>
+          <w:t>1</w:t>
+        </w:r>
+        <w:r>
+          <w:rPr>
+            <w:rStyle w:val="PageNumber"/>
+          </w:rPr>
+          <w:fldChar w:fldCharType="end"/>
+        </w:r>
+      </w:p>
+    </w:sdtContent>
+  </w:sdt>
+  <w:p>
+    <w:pPr>
+      <w:pStyle w:val="Footer"/>
+      <w:ind w:right="360"/>
+    </w:pPr>
+  </w:p>
+</w:ftr>
+</file>
+
+<file path=word/footnotes.xml><?xml version="1.0" encoding="utf-8"?>
+<w:footnotes xmlns:wpc="http://schemas.microsoft.com/office/word/2010/wordprocessingCanvas" xmlns:cx="http://schemas.microsoft.com/office/drawing/2014/chartex" xmlns:cx1="http://schemas.microsoft.com/office/drawing/2015/9/8/chartex" xmlns:cx2="http://schemas.microsoft.com/office/drawing/2015/10/21/chartex" xmlns:cx3="http://schemas.microsoft.com/office/drawing/2016/5/9/chartex" xmlns:cx4="http://schemas.microsoft.com/office/drawing/2016/5/10/chartex" xmlns:cx5="http://schemas.microsoft.com/office/drawing/2016/5/11/chartex" xmlns:cx6="http://schemas.microsoft.com/office/drawing/2016/5/12/chartex" xmlns:cx7="http://schemas.microsoft.com/office/drawing/2016/5/13/chartex" xmlns:cx8="http://schemas.microsoft.com/office/drawing/2016/5/14/chartex" xmlns:mc="http://schemas.openxmlformats.org/markup-compatibility/2006" xmlns:m="http://schemas.openxmlformats.org/officeDocument/2006/math" xmlns:aink="http://schemas.microsoft.com/office/drawing/2016/ink" xmlns:am3d="http://schemas.microsoft.com/office/drawing/2017/model3d" xmlns:oel="http://schemas.microsoft.com/office/2019/extlst" xmlns:r="http://schemas.openxmlformats.org/officeDocument/2006/relationships" xmlns:wp14="http://schemas.microsoft.com/office/word/2010/wordprocessingDrawing" xmlns:wp="http://schemas.openxmlformats.org/drawingml/2006/wordprocessingDrawing" xmlns:wpg="http://schemas.microsoft.com/office/word/2010/wordprocessingGroup" xmlns:wpi="http://schemas.microsoft.com/office/word/2010/wordprocessingInk" xmlns:wps="http://schemas.microsoft.com/office/word/2010/wordprocessingShape" xmlns:o="urn:schemas-microsoft-com:office:office" xmlns:v="urn:schemas-microsoft-com:vml" xmlns:w10="urn:schemas-microsoft-com:office:word" xmlns:w="http://schemas.openxmlformats.org/wordprocessingml/2006/main" xmlns:w14="http://schemas.microsoft.com/office/word/2010/wordml" xmlns:w15="http://schemas.microsoft.com/office/word/2012/wordml" xmlns:w16cex="http://schemas.microsoft.com/office/word/2018/wordml/cex" xmlns:w16cid="http://schemas.microsoft.com/office/word/2016/wordml/cid" xmlns:w16="http://schemas.microsoft.com/office/word/2018/wordml" xmlns:w16sdtdh="http://schemas.microsoft.com/office/word/2020/wordml/sdtdatahash" xmlns:w16sdtfl="http://schemas.microsoft.com/office/word/2024/wordml/sdtformatlock" xmlns:w16se="http://schemas.microsoft.com/office/word/2015/wordml/symex" xmlns:w16du="http://schemas.microsoft.com/office/word/2023/wordml/word16du" xmlns:wne="http://schemas.microsoft.com/office/word/2006/wordml" mc:Ignorable="w14 w15 w16se w16cid w16 w16cex w16sdtdh w16sdtfl w16du wp14">
+  <w:footnote w:type="separator" w:id="-1">
+    <w:p>
+      <w:pPr>
+        <w:spacing w:after="0" w:line="240" w:lineRule="auto"/>
+      </w:pPr>
+      <w:r>
+        <w:separator/>
+      </w:r>
+    </w:p>
+  </w:footnote>
+  <w:footnote w:type="continuationSeparator" w:id="0">
+    <w:p>
+      <w:pPr>
+        <w:spacing w:after="0" w:line="240" w:lineRule="auto"/>
+      </w:pPr>
+      <w:r>
+        <w:continuationSeparator/>
+      </w:r>
+    </w:p>
+  </w:footnote>
+</w:footnotes>
 </file>
 
 <file path=word/numbering.xml><?xml version="1.0" encoding="utf-8"?>
@@ -6989,6 +7183,74 @@
       <w:color w:val="666666"/>
     </w:rPr>
   </w:style>
+  <w:style w:type="paragraph" w:styleId="Header">
+    <w:name w:val="header"/>
+    <w:basedOn w:val="Normal"/>
+    <w:link w:val="HeaderChar"/>
+    <w:uiPriority w:val="99"/>
+    <w:unhideWhenUsed/>
+    <w:rsid w:val="0003125C"/>
+    <w:pPr>
+      <w:tabs>
+        <w:tab w:val="center" w:pos="4513"/>
+        <w:tab w:val="right" w:pos="9026"/>
+      </w:tabs>
+      <w:spacing w:after="0" w:line="240" w:lineRule="auto"/>
+    </w:pPr>
+  </w:style>
+  <w:style w:type="character" w:customStyle="1" w:styleId="HeaderChar">
+    <w:name w:val="Header Char"/>
+    <w:basedOn w:val="DefaultParagraphFont"/>
+    <w:link w:val="Header"/>
+    <w:uiPriority w:val="99"/>
+    <w:rsid w:val="0003125C"/>
+    <w:rPr>
+      <w:rFonts w:ascii="Calibri" w:hAnsi="Calibri"/>
+      <w:kern w:val="0"/>
+      <w:sz w:val="22"/>
+      <w:szCs w:val="22"/>
+      <w:lang w:val="it-IT"/>
+      <w14:ligatures w14:val="none"/>
+    </w:rPr>
+  </w:style>
+  <w:style w:type="paragraph" w:styleId="Footer">
+    <w:name w:val="footer"/>
+    <w:basedOn w:val="Normal"/>
+    <w:link w:val="FooterChar"/>
+    <w:uiPriority w:val="99"/>
+    <w:unhideWhenUsed/>
+    <w:rsid w:val="0003125C"/>
+    <w:pPr>
+      <w:tabs>
+        <w:tab w:val="center" w:pos="4513"/>
+        <w:tab w:val="right" w:pos="9026"/>
+      </w:tabs>
+      <w:spacing w:after="0" w:line="240" w:lineRule="auto"/>
+    </w:pPr>
+  </w:style>
+  <w:style w:type="character" w:customStyle="1" w:styleId="FooterChar">
+    <w:name w:val="Footer Char"/>
+    <w:basedOn w:val="DefaultParagraphFont"/>
+    <w:link w:val="Footer"/>
+    <w:uiPriority w:val="99"/>
+    <w:rsid w:val="0003125C"/>
+    <w:rPr>
+      <w:rFonts w:ascii="Calibri" w:hAnsi="Calibri"/>
+      <w:kern w:val="0"/>
+      <w:sz w:val="22"/>
+      <w:szCs w:val="22"/>
+      <w:lang w:val="it-IT"/>
+      <w14:ligatures w14:val="none"/>
+    </w:rPr>
+  </w:style>
+  <w:style w:type="character" w:styleId="PageNumber">
+    <w:name w:val="page number"/>
+    <w:basedOn w:val="DefaultParagraphFont"/>
+    <w:uiPriority w:val="99"/>
+    <w:semiHidden/>
+    <w:unhideWhenUsed/>
+    <w:rsid w:val="0003125C"/>
+  </w:style>
 </w:styles>
 </file>
 

</xml_diff>

<commit_message>
Add temporary file for document edits by Filippo Depetri
</commit_message>
<xml_diff>
--- a/Relazione reti logiche.docx
+++ b/Relazione reti logiche.docx
@@ -3133,7 +3133,7 @@
           <w14:ligatures w14:val="standardContextual"/>
         </w:rPr>
         <w:drawing>
-          <wp:inline distT="0" distB="0" distL="0" distR="0" wp14:anchorId="7B8BEAF2" wp14:editId="1BE9B9E3">
+          <wp:inline distT="0" distB="0" distL="0" distR="0" wp14:anchorId="7B8BEAF2" wp14:editId="4A5A2670">
             <wp:extent cx="5731510" cy="1031875"/>
             <wp:effectExtent l="0" t="0" r="0" b="0"/>
             <wp:docPr id="944548463" name="Picture 4"/>
@@ -3640,6 +3640,18 @@
       </w:r>
       <w:r>
         <w:t xml:space="preserve"> durante il quarto ciclo di clock e che il risultato sia corretto.</w:t>
+      </w:r>
+      <w:r>
+        <w:t xml:space="preserve"> </w:t>
+      </w:r>
+      <w:r>
+        <w:t xml:space="preserve">Il tempo di test è stato fissato a 2 </w:t>
+      </w:r>
+      <w:r>
+        <w:sym w:font="Symbol" w:char="F06D"/>
+      </w:r>
+      <w:r>
+        <w:t>s.</w:t>
       </w:r>
     </w:p>
     <w:p>

</xml_diff>

<commit_message>
Update document file with recent changes
</commit_message>
<xml_diff>
--- a/Relazione reti logiche.docx
+++ b/Relazione reti logiche.docx
@@ -883,9 +883,6 @@
       </w:r>
     </w:p>
     <w:p>
-      <w:pPr>
-        <w:ind w:left="360"/>
-      </w:pPr>
       <w:r>
         <w:lastRenderedPageBreak/>
         <w:t>Agli ingressi e alle uscite sono presenti registri parallelo parallelo con bistabili di tipo D</w:t>
@@ -3133,7 +3130,7 @@
           <w14:ligatures w14:val="standardContextual"/>
         </w:rPr>
         <w:drawing>
-          <wp:inline distT="0" distB="0" distL="0" distR="0" wp14:anchorId="7B8BEAF2" wp14:editId="4A5A2670">
+          <wp:inline distT="0" distB="0" distL="0" distR="0" wp14:anchorId="7B8BEAF2" wp14:editId="141D7ED5">
             <wp:extent cx="5731510" cy="1031875"/>
             <wp:effectExtent l="0" t="0" r="0" b="0"/>
             <wp:docPr id="944548463" name="Picture 4"/>

</xml_diff>